<commit_message>
Adapt copy for US Chareidi audience; fix phones and Pa'amonim filename
Chassidic/Chareidi/Litvish spellings, Seminary for Seminar,
'across Israel' instead of 'nationwide', international phone format.

Co-Authored-By: Claude Fable 5 <noreply@anthropic.com>
Claude-Session: https://claude.ai/code/session_01S22GsGDwY9o4j7fUg35FU1
</commit_message>
<xml_diff>
--- a/website-pages/01_Oel_Main_page.docx
+++ b/website-pages/01_Oel_Main_page.docx
@@ -56,7 +56,7 @@
     </w:p>
     <w:p>
       <w:r>
-        <w:t>Oel is a nationwide network providing education, therapy, and support for children and young adults with special needs. We combine professional expertise with a warm, supportive environment that respects each family’s religious values, community, and way of life.</w:t>
+        <w:t>Oel is a network across Israel providing education, therapy, and support for children and young adults with special needs. We combine professional expertise with a warm, supportive environment that respects each family’s religious values, community, and way of life.</w:t>
       </w:r>
     </w:p>
     <w:p>
@@ -153,7 +153,7 @@
     </w:p>
     <w:p>
       <w:r>
-        <w:t>Oel operates dozens of educational and rehabilitation programs, from early childhood through postsecondary education, serving boys and girls in both Haredi and broader community settings.</w:t>
+        <w:t>Oel operates dozens of educational and rehabilitation programs, from early childhood through postsecondary education, serving boys and girls in both Chareidi and broader community settings.</w:t>
       </w:r>
     </w:p>
     <w:p>
@@ -566,7 +566,7 @@
     </w:p>
     <w:p>
       <w:r>
-        <w:t>Nationwide Reach</w:t>
+        <w:t>Across Israel</w:t>
       </w:r>
     </w:p>
     <w:p>

</xml_diff>